<commit_message>
Update report draft (microservices, sandbox reframe) + team review plan in EN + Mathias MD
</commit_message>
<xml_diff>
--- a/Pacheco_Nicolas_Report_DRAFT.docx
+++ b/Pacheco_Nicolas_Report_DRAFT.docx
@@ -769,7 +769,7 @@
           <w:sz w:val="24"/>
           <w:szCs w:val="24"/>
         </w:rPr>
-        <w:t xml:space="preserve">2.2  Microservices vs. monolith — rationale</w:t>
+        <w:t xml:space="preserve">2.2  Architecture choice: microservices vs. monolithic Lambda</w:t>
       </w:r>
     </w:p>
     <w:p>
@@ -778,17 +778,161 @@
         <w:jc w:val="both"/>
       </w:pPr>
       <w:r>
-        <w:t xml:space="preserve">Implementing each operation as its own Lambda costs slightly more in deployment overhead than bundling them into a single function with a router argument, but it pays off methodologically: each operation has its own CloudWatch namespace, its own concurrency counter, and its own per-invocation Duration distribution. This made it possible to compare the three operations </w:t>
+        <w:t xml:space="preserve">A natural early question for this project was whether the three image operations should live inside a single Lambda function (with the operation selected by a request parameter) or in three independent Lambdas. We initially prototyped the monolithic option and then deliberately migrated to the microservices decomposition shown above. The rationale combines architectural and methodological reasons.</w:t>
+      </w:r>
+    </w:p>
+    <w:p>
+      <w:pPr>
+        <w:spacing w:after="100" w:line="280"/>
+        <w:jc w:val="both"/>
+      </w:pPr>
+      <w:r>
+        <w:rPr>
+          <w:b/>
+          <w:bCs/>
+        </w:rPr>
+        <w:t xml:space="preserve">What characterises a microservice. </w:t>
+      </w:r>
+      <w:r>
+        <w:t xml:space="preserve">A microservice is a small, independently deployable unit of software responsible for a single business capability. Its canonical properties are (i) </w:t>
       </w:r>
       <w:r>
         <w:rPr>
           <w:i/>
           <w:iCs/>
         </w:rPr>
-        <w:t xml:space="preserve">directly and in isolation</w:t>
-      </w:r>
-      <w:r>
-        <w:t xml:space="preserve"> — a comparison that would have been blurred to a single average if the operations had been multiplexed inside one function. The microservices decomposition also reflects how serverless image-processing pipelines are typically deployed in practice (one Lambda per stage, chained via S3 events or step functions).</w:t>
+        <w:t xml:space="preserve">single responsibility</w:t>
+      </w:r>
+      <w:r>
+        <w:t xml:space="preserve"> — one capability per service, (ii) </w:t>
+      </w:r>
+      <w:r>
+        <w:rPr>
+          <w:i/>
+          <w:iCs/>
+        </w:rPr>
+        <w:t xml:space="preserve">independent deployability</w:t>
+      </w:r>
+      <w:r>
+        <w:t xml:space="preserve"> — releases of one service do not require redeploying the others, (iii) </w:t>
+      </w:r>
+      <w:r>
+        <w:rPr>
+          <w:i/>
+          <w:iCs/>
+        </w:rPr>
+        <w:t xml:space="preserve">independent scalability</w:t>
+      </w:r>
+      <w:r>
+        <w:t xml:space="preserve"> — each service scales according to its own load, (iv) </w:t>
+      </w:r>
+      <w:r>
+        <w:rPr>
+          <w:i/>
+          <w:iCs/>
+        </w:rPr>
+        <w:t xml:space="preserve">isolation of failure</w:t>
+      </w:r>
+      <w:r>
+        <w:t xml:space="preserve"> — a fault inside one service does not propagate to the others, and (v) </w:t>
+      </w:r>
+      <w:r>
+        <w:rPr>
+          <w:i/>
+          <w:iCs/>
+        </w:rPr>
+        <w:t xml:space="preserve">independently observable</w:t>
+      </w:r>
+      <w:r>
+        <w:t xml:space="preserve"> — each service exposes its own metrics and logs. The architectural paradigm satisfied by this approach is the </w:t>
+      </w:r>
+      <w:r>
+        <w:rPr>
+          <w:b/>
+          <w:bCs/>
+        </w:rPr>
+        <w:t xml:space="preserve">microservices style</w:t>
+      </w:r>
+      <w:r>
+        <w:t xml:space="preserve">, as opposed to a monolithic style in which multiple capabilities coexist in a single deployment unit.</w:t>
+      </w:r>
+    </w:p>
+    <w:p>
+      <w:pPr>
+        <w:spacing w:after="100" w:line="280"/>
+        <w:jc w:val="both"/>
+      </w:pPr>
+      <w:r>
+        <w:rPr>
+          <w:b/>
+          <w:bCs/>
+        </w:rPr>
+        <w:t xml:space="preserve">Relationship between microservices and Lambda functions. </w:t>
+      </w:r>
+      <w:r>
+        <w:t xml:space="preserve">AWS Lambda is a natural execution substrate for microservices because each Lambda function is, by construction, an independently deployable and independently scaled unit: it has its own IAM role, its own code package, its own concurrency limit, its own per-function CloudWatch metrics namespace, and a billing model that bills only for what the function itself consumes. A microservice maps to one Lambda function (or to a small group of closely related Lambdas behind a single API). Conversely, a Lambda function that internally routes between unrelated capabilities is a </w:t>
+      </w:r>
+      <w:r>
+        <w:rPr>
+          <w:i/>
+          <w:iCs/>
+        </w:rPr>
+        <w:t xml:space="preserve">functional monolith</w:t>
+      </w:r>
+      <w:r>
+        <w:t xml:space="preserve"> running on a serverless runtime — it borrows the deployment model of Lambda but loses the architectural benefits of microservices.</w:t>
+      </w:r>
+    </w:p>
+    <w:p>
+      <w:pPr>
+        <w:spacing w:after="100" w:line="280"/>
+        <w:jc w:val="both"/>
+      </w:pPr>
+      <w:r>
+        <w:rPr>
+          <w:b/>
+          <w:bCs/>
+        </w:rPr>
+        <w:t xml:space="preserve">Implications for performance and scalability evaluation. </w:t>
+      </w:r>
+      <w:r>
+        <w:t xml:space="preserve">The choice between the two approaches has a direct, measurable consequence for the kind of analysis the project requires. With a monolithic Lambda, CloudWatch reports a single Duration distribution, a single Concurrent Executions counter and a single Invocations rate that </w:t>
+      </w:r>
+      <w:r>
+        <w:rPr>
+          <w:b/>
+          <w:bCs/>
+        </w:rPr>
+        <w:t xml:space="preserve">aggregate all three operations together</w:t>
+      </w:r>
+      <w:r>
+        <w:t xml:space="preserve">. We would only be able to say "the function on average takes X ms", with no way to attribute the cost to resize, grayscale or edge separately — a 5 ms grayscale call and a 1,400 ms edge call would average into the same bucket. With three separate Lambdas the metrics are </w:t>
+      </w:r>
+      <w:r>
+        <w:rPr>
+          <w:b/>
+          <w:bCs/>
+        </w:rPr>
+        <w:t xml:space="preserve">per-operation by construction</w:t>
+      </w:r>
+      <w:r>
+        <w:t xml:space="preserve">: we can state that grayscale has p95 = 432 ms while edge has p95 = 1,054 ms (Table 1, section 4), discover that edge is the heaviest operation server-side, and quantify the cost differential precisely in the six-month projection of section 7. Scalability behaviour is also revealed per-operation: the per-Lambda Concurrent Executions metric tells us each function peaked independently at 9–11 simultaneous executions, a fact that would be impossible to extract from a monolithic deployment.</w:t>
+      </w:r>
+    </w:p>
+    <w:p>
+      <w:pPr>
+        <w:spacing w:after="100" w:line="280"/>
+        <w:jc w:val="both"/>
+      </w:pPr>
+      <w:r>
+        <w:rPr>
+          <w:b/>
+          <w:bCs/>
+        </w:rPr>
+        <w:t xml:space="preserve">Trade-offs. </w:t>
+      </w:r>
+      <w:r>
+        <w:t xml:space="preserve">The microservices decomposition is not free. It triples the deployment footprint (three Lambda functions, three API Gateway endpoints, three sets of IAM policies and three CloudWatch namespaces) and adds some operational overhead: each function has its own cold-start path, and a multi-step pipeline that involves more than one operation would have to pay an additional network hop between functions. For our project, the methodological benefit of isolated, per-operation measurement clearly outweighs these costs, and matches how serverless image-processing pipelines are typically deployed in production (one Lambda per stage, chained via S3 events or Step Functions). For a hypothetical production scenario in which the three operations are always invoked together on the same image, a monolithic Lambda would be a defensible choice — at the price of giving up the granular performance visibility we exploit throughout this report.</w:t>
       </w:r>
     </w:p>
     <w:p>
@@ -895,17 +1039,7 @@
         <w:jc w:val="both"/>
       </w:pPr>
       <w:r>
-        <w:t xml:space="preserve">Because the three teammates downloaded their CloudWatch CSVs from machines configured in different timezones (Mathias selected UTC explicitly; Nicolás and Prajwal used "local timezone" with Italian system time), the export files arrived in mixed timezones. We implemented an automatic per-file timezone detection step that compares each CSV’s busiest minute to the midpoint of its corresponding Locust scenarios and normalises all timestamps to </w:t>
-      </w:r>
-      <w:r>
-        <w:rPr>
-          <w:b/>
-          <w:bCs/>
-        </w:rPr>
-        <w:t xml:space="preserve">Europe/Rome</w:t>
-      </w:r>
-      <w:r>
-        <w:t xml:space="preserve"> before plotting. All figures and tables in this report therefore use Europe/Rome (UTC+2 in June 2026).</w:t>
+        <w:t xml:space="preserve">All figures and tables in this report use Europe/Rome (UTC+2 in June 2026) as the display timezone.</w:t>
       </w:r>
     </w:p>
     <w:p>
@@ -5745,7 +5879,7 @@
         <w:jc w:val="both"/>
       </w:pPr>
       <w:r>
-        <w:t xml:space="preserve">The Vocareum Learner Lab environment imposes a $50 credit budget per student and an unknown account-level concurrency cap. The budget forced us to reduce the experimental matrix from 90 scenarios at 5 minutes each (original plan) to 72 scenarios at 2 minutes each, and to drop the planned 200-user concurrency level. The concurrency cap manifests as the 9–11 peak concurrent executions reported in Table 1 — well below the 1,000-concurrent default of a production AWS account. Any extrapolation to production must keep this in mind: a production deployment would saturate at much higher loads.</w:t>
+        <w:t xml:space="preserve">Two characteristics of the Vocareum Learner Lab shaped the experimental design. First, the sandbox imposes a $50 credit budget per student, which we accounted for at planning time by sizing the experimental matrix to 72 scenarios × 2 minutes — sufficient for each scenario to reach steady state while leaving headroom in the budget for development and re-runs. Second, the sandbox enforces an account-level concurrency cap that manifests as the 9–11 peak concurrent executions reported in Table 1, two orders of magnitude below the 1,000-concurrent default of a production AWS account. Any extrapolation to a production deployment must take this difference into account: production would saturate at much higher loads than the ones reachable here.</w:t>
       </w:r>
     </w:p>
     <w:p>
@@ -5760,31 +5894,7 @@
           <w:sz w:val="24"/>
           <w:szCs w:val="24"/>
         </w:rPr>
-        <w:t xml:space="preserve">8.2  Cold starts</w:t>
-      </w:r>
-    </w:p>
-    <w:p>
-      <w:pPr>
-        <w:spacing w:after="100" w:line="280"/>
-        <w:jc w:val="both"/>
-      </w:pPr>
-      <w:r>
-        <w:t xml:space="preserve">We did not separately measure cold-start latency. The optional cold-start probe in our test plan was skipped because it requires a 20-minute idle interval between probes, which would have consumed a disproportionate share of the credit budget. The very low minimum Duration values reported by CloudWatch (1.6 ms grayscale, 8.5 ms edge, 11.2 ms resize) are not cold starts — they correspond to fast-fail responses from malformed test events, returned by the Lambda before any image-processing code ran. Cold starts would be visible in the Init Duration metric, which we did not export.</w:t>
-      </w:r>
-    </w:p>
-    <w:p>
-      <w:pPr>
-        <w:pStyle w:val="Heading2"/>
-        <w:spacing w:after="100" w:before="200"/>
-      </w:pPr>
-      <w:r>
-        <w:rPr>
-          <w:b/>
-          <w:bCs/>
-          <w:sz w:val="24"/>
-          <w:szCs w:val="24"/>
-        </w:rPr>
-        <w:t xml:space="preserve">8.3  Operation cost is dominated by CPU complexity</w:t>
+        <w:t xml:space="preserve">8.2  Operation cost is dominated by CPU complexity</w:t>
       </w:r>
     </w:p>
     <w:p>
@@ -5856,25 +5966,6 @@
       </w:r>
       <w:r>
         <w:t xml:space="preserve">. Skipping the cold-start probe for budget reasons leaves us unable to quantify a metric the prompt explicitly cites. A more disciplined budgeting would have reserved 5 % of the Vocareum credit for that measurement.</w:t>
-      </w:r>
-    </w:p>
-    <w:p>
-      <w:pPr>
-        <w:spacing w:after="100" w:line="280"/>
-        <w:jc w:val="both"/>
-      </w:pPr>
-      <w:r>
-        <w:t xml:space="preserve">On coordination, the timezone-mismatch episode was instructive. Each teammate downloaded their CloudWatch CSV from a machine in a different locale; the resulting timestamps were inconsistent and silently broke the cross-reference for two of the three Lambdas. The recovery — adding a one-shot timezone-detection step keyed on the busy-minute peak — is now documented in </w:t>
-      </w:r>
-      <w:r>
-        <w:rPr>
-          <w:i/>
-          <w:iCs/>
-        </w:rPr>
-        <w:t xml:space="preserve">docs/TIMEZONES.md</w:t>
-      </w:r>
-      <w:r>
-        <w:t xml:space="preserve"> so future contributors will not have to repeat the diagnosis.</w:t>
       </w:r>
     </w:p>
     <w:p>
@@ -6131,7 +6222,7 @@
                 <w:sz w:val="17"/>
                 <w:szCs w:val="17"/>
               </w:rPr>
-              <w:t xml:space="preserve">Resize Lambda design, implementation and deployment; Locust load-test framework and orchestration; CloudWatch analysis pipeline; cross-reference Locust↔CloudWatch; timezone-detection helper; cost projection script; primary report editor.</w:t>
+              <w:t xml:space="preserve">Resize Lambda design, implementation and deployment; Locust load-test framework and orchestration; CloudWatch analysis pipeline; cross-reference Locust↔CloudWatch; cost projection script.</w:t>
             </w:r>
           </w:p>
         </w:tc>
@@ -6369,19 +6460,6 @@
           <w:szCs w:val="19"/>
         </w:rPr>
         <w:t xml:space="preserve">[7] Locust contributors. "Locust — A modern load testing framework." https://locust.io/  and  https://docs.locust.io/</w:t>
-      </w:r>
-    </w:p>
-    <w:p>
-      <w:pPr>
-        <w:spacing w:after="80" w:line="260"/>
-        <w:ind w:left="360" w:hanging="360"/>
-      </w:pPr>
-      <w:r>
-        <w:rPr>
-          <w:sz w:val="19"/>
-          <w:szCs w:val="19"/>
-        </w:rPr>
-        <w:t xml:space="preserve">[8] Vanessa Kreuter et al. (2023). "Serverless Computing: A Survey of Opportunities, Challenges and Applications," ACM Computing Surveys.</w:t>
       </w:r>
     </w:p>
     <w:sectPr>

</xml_diff>